<commit_message>
Fix TC609 evidence bundle status
</commit_message>
<xml_diff>
--- a/行业通识数据_tc609_industry_general_evidence_bundle/industry_general_dataset/蓝莓成熟度图像目标检测数据集说明文档.docx
+++ b/行业通识数据_tc609_industry_general_evidence_bundle/industry_general_dataset/蓝莓成熟度图像目标检测数据集说明文档.docx
@@ -429,34 +429,7 @@
         <w:jc w:val="left"/>
       </w:pPr>
       <w:r>
-        <w:rPr>
-          <w:rFonts w:ascii="宋体" w:hAnsi="宋体" w:eastAsia="宋体" w:cs="宋体"/>
-          <w:kern w:val="0"/>
-          <w:sz w:val="24"/>
-          <w:szCs w:val="24"/>
-          <w:lang w:val="en-US" w:eastAsia="zh-CN" w:bidi="ar"/>
-        </w:rPr>
-        <w:t>1.5样本总量：清洗后有效标注图像2731张。原始采集图像3000张，其中</w:t>
-      </w:r>
-      <w:r>
-        <w:rPr>
-          <w:rFonts w:hint="eastAsia" w:ascii="宋体" w:hAnsi="宋体" w:eastAsia="宋体" w:cs="宋体"/>
-          <w:kern w:val="0"/>
-          <w:sz w:val="24"/>
-          <w:szCs w:val="24"/>
-          <w:lang w:val="en-US" w:eastAsia="zh-CN" w:bidi="ar"/>
-        </w:rPr>
-        <w:tab/>
-      </w:r>
-      <w:r>
-        <w:rPr>
-          <w:rFonts w:ascii="宋体" w:hAnsi="宋体" w:eastAsia="宋体" w:cs="宋体"/>
-          <w:kern w:val="0"/>
-          <w:sz w:val="24"/>
-          <w:szCs w:val="24"/>
-          <w:lang w:val="en-US" w:eastAsia="zh-CN" w:bidi="ar"/>
-        </w:rPr>
-        <w:t>269张存在缺标、模糊、遮挡严重问题，未纳入正式v1.0.0发布包</w:t>
+        <w:t>1.5样本总量：清洗后有效标注图像2731张。来源候选样本共3000张，来自 A_ZENODO_BLUEBERRY_DCM 与 B_KAGGLE_BLUEBERRY_DETECTION 两个公开图像数据集；其中269张存在缺标、模糊或遮挡严重等问题，未纳入当前v1.0.0-alpha候选包。</w:t>
       </w:r>
     </w:p>
     <w:p>
@@ -512,34 +485,7 @@
         <w:jc w:val="left"/>
       </w:pPr>
       <w:r>
-        <w:rPr>
-          <w:rFonts w:ascii="宋体" w:hAnsi="宋体" w:eastAsia="宋体" w:cs="宋体"/>
-          <w:kern w:val="0"/>
-          <w:sz w:val="24"/>
-          <w:szCs w:val="24"/>
-          <w:lang w:val="en-US" w:eastAsia="zh-CN" w:bidi="ar"/>
-        </w:rPr>
-        <w:t>1.8生成数据标志generated_data_indicator：0（实拍采集真实图像，非</w:t>
-      </w:r>
-      <w:r>
-        <w:rPr>
-          <w:rFonts w:hint="eastAsia" w:ascii="宋体" w:hAnsi="宋体" w:eastAsia="宋体" w:cs="宋体"/>
-          <w:kern w:val="0"/>
-          <w:sz w:val="24"/>
-          <w:szCs w:val="24"/>
-          <w:lang w:val="en-US" w:eastAsia="zh-CN" w:bidi="ar"/>
-        </w:rPr>
-        <w:tab/>
-      </w:r>
-      <w:r>
-        <w:rPr>
-          <w:rFonts w:ascii="宋体" w:hAnsi="宋体" w:eastAsia="宋体" w:cs="宋体"/>
-          <w:kern w:val="0"/>
-          <w:sz w:val="24"/>
-          <w:szCs w:val="24"/>
-          <w:lang w:val="en-US" w:eastAsia="zh-CN" w:bidi="ar"/>
-        </w:rPr>
-        <w:t>AI生成数据）</w:t>
+        <w:t>1.8生成数据标志generated_data_indicator：0（来源为公开真实蓝莓图像数据集，非AI生成数据；本包未声明为本项目自采原始图像）。</w:t>
       </w:r>
     </w:p>
     <w:p>
@@ -1948,34 +1894,7 @@
         <w:jc w:val="left"/>
       </w:pPr>
       <w:r>
-        <w:rPr>
-          <w:rFonts w:ascii="宋体" w:hAnsi="宋体" w:eastAsia="宋体" w:cs="宋体"/>
-          <w:kern w:val="0"/>
-          <w:sz w:val="24"/>
-          <w:szCs w:val="24"/>
-          <w:lang w:val="en-US" w:eastAsia="zh-CN" w:bidi="ar"/>
-        </w:rPr>
-        <w:t>4.1仅覆盖本项目采集蓝莓品种，其他品种果皮转色特征存在差异，跨品种</w:t>
-      </w:r>
-      <w:r>
-        <w:rPr>
-          <w:rFonts w:hint="eastAsia" w:ascii="宋体" w:hAnsi="宋体" w:eastAsia="宋体" w:cs="宋体"/>
-          <w:kern w:val="0"/>
-          <w:sz w:val="24"/>
-          <w:szCs w:val="24"/>
-          <w:lang w:val="en-US" w:eastAsia="zh-CN" w:bidi="ar"/>
-        </w:rPr>
-        <w:tab/>
-      </w:r>
-      <w:r>
-        <w:rPr>
-          <w:rFonts w:ascii="宋体" w:hAnsi="宋体" w:eastAsia="宋体" w:cs="宋体"/>
-          <w:kern w:val="0"/>
-          <w:sz w:val="24"/>
-          <w:szCs w:val="24"/>
-          <w:lang w:val="en-US" w:eastAsia="zh-CN" w:bidi="ar"/>
-        </w:rPr>
-        <w:t>直接使用模型精度会下降。</w:t>
+        <w:t>4.1仅覆盖A/B公开来源数据集中出现的蓝莓品种和场景，其他品种果皮转色特征存在差异，跨品种直接使用模型精度可能下降。</w:t>
       </w:r>
     </w:p>
     <w:p>
@@ -2010,95 +1929,21 @@
         <w:jc w:val="left"/>
       </w:pPr>
       <w:r>
-        <w:rPr>
-          <w:rFonts w:ascii="宋体" w:hAnsi="宋体" w:eastAsia="宋体" w:cs="宋体"/>
-          <w:kern w:val="0"/>
-          <w:sz w:val="24"/>
-          <w:szCs w:val="24"/>
-          <w:lang w:val="en-US" w:eastAsia="zh-CN" w:bidi="ar"/>
-        </w:rPr>
-        <w:t>4.3269张缺标、低质量图像未纳入正式数据集，如需完整原始素材需单独</w:t>
-      </w:r>
-      <w:r>
-        <w:rPr>
-          <w:rFonts w:hint="eastAsia" w:ascii="宋体" w:hAnsi="宋体" w:eastAsia="宋体" w:cs="宋体"/>
-          <w:kern w:val="0"/>
-          <w:sz w:val="24"/>
-          <w:szCs w:val="24"/>
-          <w:lang w:val="en-US" w:eastAsia="zh-CN" w:bidi="ar"/>
-        </w:rPr>
-        <w:tab/>
-      </w:r>
-      <w:r>
-        <w:rPr>
-          <w:rFonts w:ascii="宋体" w:hAnsi="宋体" w:eastAsia="宋体" w:cs="宋体"/>
-          <w:kern w:val="0"/>
-          <w:sz w:val="24"/>
-          <w:szCs w:val="24"/>
-          <w:lang w:val="en-US" w:eastAsia="zh-CN" w:bidi="ar"/>
-        </w:rPr>
-        <w:t>申请。</w:t>
-      </w:r>
-    </w:p>
-    <w:p>
-      <w:pPr>
-        <w:keepNext w:val="0"/>
-        <w:keepLines w:val="0"/>
-        <w:widowControl/>
-        <w:suppressLineNumbers w:val="0"/>
-        <w:spacing w:line="240" w:lineRule="auto"/>
-        <w:ind w:firstLine="420" w:firstLineChars="0"/>
-        <w:jc w:val="left"/>
-      </w:pPr>
-      <w:r>
-        <w:rPr>
-          <w:rFonts w:ascii="宋体" w:hAnsi="宋体" w:eastAsia="宋体" w:cs="宋体"/>
-          <w:kern w:val="0"/>
-          <w:sz w:val="24"/>
-          <w:szCs w:val="24"/>
-          <w:lang w:val="en-US" w:eastAsia="zh-CN" w:bidi="ar"/>
-        </w:rPr>
-        <w:t>4.4原始采集时间、授权、来源信息</w:t>
-      </w:r>
-      <w:r>
-        <w:rPr>
-          <w:rFonts w:hint="eastAsia" w:ascii="宋体" w:hAnsi="宋体" w:eastAsia="宋体" w:cs="宋体"/>
-          <w:kern w:val="0"/>
-          <w:sz w:val="24"/>
-          <w:szCs w:val="24"/>
-          <w:lang w:val="en-US" w:eastAsia="zh-CN" w:bidi="ar"/>
-        </w:rPr>
-        <w:t>已</w:t>
-      </w:r>
-      <w:r>
-        <w:rPr>
-          <w:rFonts w:ascii="宋体" w:hAnsi="宋体" w:eastAsia="宋体" w:cs="宋体"/>
-          <w:kern w:val="0"/>
-          <w:sz w:val="24"/>
-          <w:szCs w:val="24"/>
-          <w:lang w:val="en-US" w:eastAsia="zh-CN" w:bidi="ar"/>
-        </w:rPr>
-        <w:t>完整归档，数据集当前为TC609格</w:t>
-      </w:r>
-      <w:r>
-        <w:rPr>
-          <w:rFonts w:hint="eastAsia" w:ascii="宋体" w:hAnsi="宋体" w:eastAsia="宋体" w:cs="宋体"/>
-          <w:kern w:val="0"/>
-          <w:sz w:val="24"/>
-          <w:szCs w:val="24"/>
-          <w:lang w:val="en-US" w:eastAsia="zh-CN" w:bidi="ar"/>
-        </w:rPr>
-        <w:tab/>
-      </w:r>
-      <w:r>
-        <w:rPr>
-          <w:rFonts w:ascii="宋体" w:hAnsi="宋体" w:eastAsia="宋体" w:cs="宋体"/>
-          <w:kern w:val="0"/>
-          <w:sz w:val="24"/>
-          <w:szCs w:val="24"/>
-          <w:lang w:val="en-US" w:eastAsia="zh-CN" w:bidi="ar"/>
-        </w:rPr>
-        <w:t>式化提交包，已完成三维度质量评测（综合96.4），认定为高质量数据集（行业通识）。</w:t>
+        <w:t>4.3 269张缺标、低质量或不可稳定判读图像未纳入当前候选包，如需追溯完整来源候选样本需单独申请或查看清洗报告。</w:t>
+      </w:r>
+    </w:p>
+    <w:p>
+      <w:pPr>
+        <w:keepNext w:val="0"/>
+        <w:keepLines w:val="0"/>
+        <w:widowControl/>
+        <w:suppressLineNumbers w:val="0"/>
+        <w:spacing w:line="240" w:lineRule="auto"/>
+        <w:ind w:firstLine="420" w:firstLineChars="0"/>
+        <w:jc w:val="left"/>
+      </w:pPr>
+      <w:r>
+        <w:t>4.4来源级时间、授权、来源信息已归档；当前数据集为TC609格式化候选提交包。内部预评估结果为说明文档85.0、数据质量99.9、模型应用94.2；其中说明文档维度因真实技术支持方式和访问渠道待确认，暂不能声明三维度全部正式达标或已被认定为高质量数据集。</w:t>
       </w:r>
     </w:p>
     <w:p>
@@ -2169,88 +2014,7 @@
         </w:rPr>
       </w:pPr>
       <w:r>
-        <w:rPr>
-          <w:rFonts w:hint="default" w:ascii="宋体" w:hAnsi="宋体" w:eastAsia="宋体" w:cs="宋体"/>
-          <w:b w:val="0"/>
-          <w:bCs w:val="0"/>
-          <w:kern w:val="0"/>
-          <w:sz w:val="24"/>
-          <w:szCs w:val="24"/>
-          <w:lang w:val="en-US" w:eastAsia="zh-CN" w:bidi="ar"/>
-        </w:rPr>
-        <w:t>1.1采集方式</w:t>
-      </w:r>
-      <w:r>
-        <w:rPr>
-          <w:rFonts w:hint="eastAsia" w:cs="宋体"/>
-          <w:b w:val="0"/>
-          <w:bCs w:val="0"/>
-          <w:kern w:val="0"/>
-          <w:sz w:val="24"/>
-          <w:szCs w:val="24"/>
-          <w:lang w:val="en-US" w:eastAsia="zh-CN" w:bidi="ar"/>
-        </w:rPr>
-        <w:t>：</w:t>
-      </w:r>
-      <w:r>
-        <w:rPr>
-          <w:rFonts w:hint="default" w:ascii="宋体" w:hAnsi="宋体" w:eastAsia="宋体" w:cs="宋体"/>
-          <w:b w:val="0"/>
-          <w:bCs w:val="0"/>
-          <w:kern w:val="0"/>
-          <w:sz w:val="24"/>
-          <w:szCs w:val="24"/>
-          <w:lang w:val="en-US" w:eastAsia="zh-CN" w:bidi="ar"/>
-        </w:rPr>
-        <w:t>采用合规调用开源数据库开放API、协议内定向爬取、开源</w:t>
-      </w:r>
-      <w:r>
-        <w:rPr>
-          <w:rFonts w:hint="eastAsia" w:cs="宋体"/>
-          <w:b w:val="0"/>
-          <w:bCs w:val="0"/>
-          <w:kern w:val="0"/>
-          <w:sz w:val="24"/>
-          <w:szCs w:val="24"/>
-          <w:lang w:val="en-US" w:eastAsia="zh-CN" w:bidi="ar"/>
-        </w:rPr>
-        <w:tab/>
-      </w:r>
-      <w:r>
-        <w:rPr>
-          <w:rFonts w:hint="default" w:ascii="宋体" w:hAnsi="宋体" w:eastAsia="宋体" w:cs="宋体"/>
-          <w:b w:val="0"/>
-          <w:bCs w:val="0"/>
-          <w:kern w:val="0"/>
-          <w:sz w:val="24"/>
-          <w:szCs w:val="24"/>
-          <w:lang w:val="en-US" w:eastAsia="zh-CN" w:bidi="ar"/>
-        </w:rPr>
-        <w:t>数据包离线下载的方式，采集论文、行业标准、公开技术文档等开源行业通</w:t>
-      </w:r>
-      <w:r>
-        <w:rPr>
-          <w:rFonts w:hint="eastAsia" w:cs="宋体"/>
-          <w:b w:val="0"/>
-          <w:bCs w:val="0"/>
-          <w:kern w:val="0"/>
-          <w:sz w:val="24"/>
-          <w:szCs w:val="24"/>
-          <w:lang w:val="en-US" w:eastAsia="zh-CN" w:bidi="ar"/>
-        </w:rPr>
-        <w:tab/>
-      </w:r>
-      <w:r>
-        <w:rPr>
-          <w:rFonts w:hint="default" w:ascii="宋体" w:hAnsi="宋体" w:eastAsia="宋体" w:cs="宋体"/>
-          <w:b w:val="0"/>
-          <w:bCs w:val="0"/>
-          <w:kern w:val="0"/>
-          <w:sz w:val="24"/>
-          <w:szCs w:val="24"/>
-          <w:lang w:val="en-US" w:eastAsia="zh-CN" w:bidi="ar"/>
-        </w:rPr>
-        <w:t>识数据。</w:t>
+        <w:t>1.1采集方式：本包不是论文、行业标准或技术文档语料采集包，而是公开蓝莓图像目标检测数据集整合包。数据来源为A_ZENODO_BLUEBERRY_DCM与B_KAGGLE_BLUEBERRY_DETECTION两个公开图像数据集，经授权边界确认、清洗、再标注/格式化和元数据补全后形成候选提交包。</w:t>
       </w:r>
     </w:p>
     <w:p>
@@ -2279,46 +2043,66 @@
         </w:rPr>
       </w:pPr>
       <w:r>
-        <w:rPr>
-          <w:rFonts w:hint="default" w:ascii="宋体" w:hAnsi="宋体" w:eastAsia="宋体" w:cs="宋体"/>
-          <w:b w:val="0"/>
-          <w:bCs w:val="0"/>
-          <w:kern w:val="0"/>
-          <w:sz w:val="24"/>
-          <w:szCs w:val="24"/>
-          <w:lang w:val="en-US" w:eastAsia="zh-CN" w:bidi="ar"/>
-        </w:rPr>
-        <w:t>1.2采集流程</w:t>
-      </w:r>
-      <w:r>
-        <w:rPr>
-          <w:rFonts w:hint="eastAsia" w:cs="宋体"/>
-          <w:b w:val="0"/>
-          <w:bCs w:val="0"/>
-          <w:kern w:val="0"/>
-          <w:sz w:val="24"/>
-          <w:szCs w:val="24"/>
-          <w:lang w:val="en-US" w:eastAsia="zh-CN" w:bidi="ar"/>
-        </w:rPr>
-        <w:t>：</w:t>
-      </w:r>
-      <w:r>
-        <w:rPr>
-          <w:rFonts w:hint="default" w:ascii="宋体" w:hAnsi="宋体" w:eastAsia="宋体" w:cs="宋体"/>
-          <w:b w:val="0"/>
-          <w:bCs w:val="0"/>
-          <w:kern w:val="0"/>
-          <w:sz w:val="24"/>
-          <w:szCs w:val="24"/>
-          <w:lang w:val="en-US" w:eastAsia="zh-CN" w:bidi="ar"/>
-        </w:rPr>
-        <w:t>先筛选合规行业开源数据源，划定行业上下游中等采集范围，执</w:t>
-      </w:r>
-      <w:r>
-        <w:rPr>
-          <w:rFonts w:hint="eastAsia" w:cs="宋体"/>
-          <w:b w:val="0"/>
-          <w:bCs w:val="0"/>
+        <w:t>1.2采集流程：确认公开图像数据集来源与许可，下载或整理原始图像及标注文件，执行图像-标注配对检查、缺标/低质样本剔除、标签体系统一、YOLO格式化、来源映射与元数据归档，最终形成适配目标检测模型训练、验证和测试的数据集。</w:t>
+      </w:r>
+    </w:p>
+    <w:p>
+      <w:pPr>
+        <w:keepNext w:val="0"/>
+        <w:keepLines w:val="0"/>
+        <w:widowControl/>
+        <w:suppressLineNumbers w:val="0"/>
+        <w:spacing w:line="240" w:lineRule="auto"/>
+        <w:ind w:firstLine="420" w:firstLineChars="0"/>
+        <w:jc w:val="left"/>
+      </w:pPr>
+      <w:r>
+        <w:t>1.3采集质控：本包主要通过后处理质控降低来源数据质量风险，包括剔除全黑、严重过曝、完全无蓝莓目标、画面破损、缺少可用标注或遮挡严重的样本，并保留清洗报告。</w:t>
+      </w:r>
+    </w:p>
+    <w:p>
+      <w:pPr>
+        <w:keepNext w:val="0"/>
+        <w:keepLines w:val="0"/>
+        <w:widowControl/>
+        <w:suppressLineNumbers w:val="0"/>
+        <w:spacing w:line="240" w:lineRule="auto"/>
+        <w:jc w:val="left"/>
+      </w:pPr>
+      <w:r>
+        <w:rPr>
+          <w:rFonts w:ascii="宋体" w:hAnsi="宋体" w:eastAsia="宋体" w:cs="宋体"/>
+          <w:kern w:val="0"/>
+          <w:sz w:val="24"/>
+          <w:szCs w:val="24"/>
+          <w:lang w:val="en-US" w:eastAsia="zh-CN" w:bidi="ar"/>
+        </w:rPr>
+        <w:t>2、数据预处理</w:t>
+      </w:r>
+    </w:p>
+    <w:p>
+      <w:pPr>
+        <w:keepNext w:val="0"/>
+        <w:keepLines w:val="0"/>
+        <w:widowControl/>
+        <w:suppressLineNumbers w:val="0"/>
+        <w:spacing w:line="240" w:lineRule="auto"/>
+        <w:ind w:firstLine="420" w:firstLineChars="0"/>
+        <w:jc w:val="left"/>
+      </w:pPr>
+      <w:r>
+        <w:rPr>
+          <w:rFonts w:ascii="宋体" w:hAnsi="宋体" w:eastAsia="宋体" w:cs="宋体"/>
+          <w:kern w:val="0"/>
+          <w:sz w:val="24"/>
+          <w:szCs w:val="24"/>
+          <w:lang w:val="en-US" w:eastAsia="zh-CN" w:bidi="ar"/>
+        </w:rPr>
+        <w:t>2.1数据清洗：剔除全黑、严重过曝、完全无蓝莓目标、画面破损图像；筛</w:t>
+      </w:r>
+      <w:r>
+        <w:rPr>
+          <w:rFonts w:hint="eastAsia" w:ascii="宋体" w:hAnsi="宋体" w:eastAsia="宋体" w:cs="宋体"/>
           <w:kern w:val="0"/>
           <w:sz w:val="24"/>
           <w:szCs w:val="24"/>
@@ -2328,21 +2112,100 @@
       </w:r>
       <w:r>
         <w:rPr>
-          <w:rFonts w:hint="default" w:ascii="宋体" w:hAnsi="宋体" w:eastAsia="宋体" w:cs="宋体"/>
-          <w:b w:val="0"/>
-          <w:bCs w:val="0"/>
-          <w:kern w:val="0"/>
-          <w:sz w:val="24"/>
-          <w:szCs w:val="24"/>
-          <w:lang w:val="en-US" w:eastAsia="zh-CN" w:bidi="ar"/>
-        </w:rPr>
-        <w:t>行开源数据采集后完成清洗，由行业背景人员审核合规性，分类归档留存溯</w:t>
-      </w:r>
-      <w:r>
-        <w:rPr>
-          <w:rFonts w:hint="eastAsia" w:cs="宋体"/>
-          <w:b w:val="0"/>
-          <w:bCs w:val="0"/>
+          <w:rFonts w:ascii="宋体" w:hAnsi="宋体" w:eastAsia="宋体" w:cs="宋体"/>
+          <w:kern w:val="0"/>
+          <w:sz w:val="24"/>
+          <w:szCs w:val="24"/>
+          <w:lang w:val="en-US" w:eastAsia="zh-CN" w:bidi="ar"/>
+        </w:rPr>
+        <w:t>除269张无法标注的低质量图片。</w:t>
+      </w:r>
+    </w:p>
+    <w:p>
+      <w:pPr>
+        <w:keepNext w:val="0"/>
+        <w:keepLines w:val="0"/>
+        <w:widowControl/>
+        <w:suppressLineNumbers w:val="0"/>
+        <w:spacing w:line="240" w:lineRule="auto"/>
+        <w:ind w:firstLine="420" w:firstLineChars="0"/>
+        <w:jc w:val="left"/>
+      </w:pPr>
+      <w:r>
+        <w:rPr>
+          <w:rFonts w:ascii="宋体" w:hAnsi="宋体" w:eastAsia="宋体" w:cs="宋体"/>
+          <w:kern w:val="0"/>
+          <w:sz w:val="24"/>
+          <w:szCs w:val="24"/>
+          <w:lang w:val="en-US" w:eastAsia="zh-CN" w:bidi="ar"/>
+        </w:rPr>
+        <w:t>2.2数据验证：核对图像完整性、无重复、无水印乱码干扰。</w:t>
+      </w:r>
+    </w:p>
+    <w:p>
+      <w:pPr>
+        <w:keepNext w:val="0"/>
+        <w:keepLines w:val="0"/>
+        <w:widowControl/>
+        <w:suppressLineNumbers w:val="0"/>
+        <w:spacing w:line="240" w:lineRule="auto"/>
+        <w:ind w:firstLine="420" w:firstLineChars="0"/>
+        <w:jc w:val="left"/>
+      </w:pPr>
+      <w:r>
+        <w:rPr>
+          <w:rFonts w:ascii="宋体" w:hAnsi="宋体" w:eastAsia="宋体" w:cs="宋体"/>
+          <w:kern w:val="0"/>
+          <w:sz w:val="24"/>
+          <w:szCs w:val="24"/>
+          <w:lang w:val="en-US" w:eastAsia="zh-CN" w:bidi="ar"/>
+        </w:rPr>
+        <w:t>2.3数据抽样：分层筛选2731张有效样本，保证三类成熟度样本均衡。</w:t>
+      </w:r>
+    </w:p>
+    <w:p>
+      <w:pPr>
+        <w:keepNext w:val="0"/>
+        <w:keepLines w:val="0"/>
+        <w:widowControl/>
+        <w:suppressLineNumbers w:val="0"/>
+        <w:spacing w:line="240" w:lineRule="auto"/>
+        <w:jc w:val="left"/>
+      </w:pPr>
+      <w:r>
+        <w:rPr>
+          <w:rFonts w:ascii="宋体" w:hAnsi="宋体" w:eastAsia="宋体" w:cs="宋体"/>
+          <w:kern w:val="0"/>
+          <w:sz w:val="24"/>
+          <w:szCs w:val="24"/>
+          <w:lang w:val="en-US" w:eastAsia="zh-CN" w:bidi="ar"/>
+        </w:rPr>
+        <w:t>3、数据标注流程</w:t>
+      </w:r>
+    </w:p>
+    <w:p>
+      <w:pPr>
+        <w:keepNext w:val="0"/>
+        <w:keepLines w:val="0"/>
+        <w:widowControl/>
+        <w:suppressLineNumbers w:val="0"/>
+        <w:spacing w:line="240" w:lineRule="auto"/>
+        <w:ind w:firstLine="420" w:firstLineChars="0"/>
+        <w:jc w:val="left"/>
+      </w:pPr>
+      <w:r>
+        <w:rPr>
+          <w:rFonts w:ascii="宋体" w:hAnsi="宋体" w:eastAsia="宋体" w:cs="宋体"/>
+          <w:kern w:val="0"/>
+          <w:sz w:val="24"/>
+          <w:szCs w:val="24"/>
+          <w:lang w:val="en-US" w:eastAsia="zh-CN" w:bidi="ar"/>
+        </w:rPr>
+        <w:t>3.1标注培训：全体标注人员统一学习《蓝莓果实成熟度标注分类规范》，</w:t>
+      </w:r>
+      <w:r>
+        <w:rPr>
+          <w:rFonts w:hint="eastAsia" w:ascii="宋体" w:hAnsi="宋体" w:eastAsia="宋体" w:cs="宋体"/>
           <w:kern w:val="0"/>
           <w:sz w:val="24"/>
           <w:szCs w:val="24"/>
@@ -2352,193 +2215,6 @@
       </w:r>
       <w:r>
         <w:rPr>
-          <w:rFonts w:hint="default" w:ascii="宋体" w:hAnsi="宋体" w:eastAsia="宋体" w:cs="宋体"/>
-          <w:b w:val="0"/>
-          <w:bCs w:val="0"/>
-          <w:kern w:val="0"/>
-          <w:sz w:val="24"/>
-          <w:szCs w:val="24"/>
-          <w:lang w:val="en-US" w:eastAsia="zh-CN" w:bidi="ar"/>
-        </w:rPr>
-        <w:t>源信息，最终形成适配通用及行业模型训练的数据集。</w:t>
-      </w:r>
-    </w:p>
-    <w:p>
-      <w:pPr>
-        <w:keepNext w:val="0"/>
-        <w:keepLines w:val="0"/>
-        <w:widowControl/>
-        <w:suppressLineNumbers w:val="0"/>
-        <w:spacing w:line="240" w:lineRule="auto"/>
-        <w:ind w:firstLine="420" w:firstLineChars="0"/>
-        <w:jc w:val="left"/>
-      </w:pPr>
-      <w:r>
-        <w:rPr>
-          <w:rFonts w:ascii="宋体" w:hAnsi="宋体" w:eastAsia="宋体" w:cs="宋体"/>
-          <w:kern w:val="0"/>
-          <w:sz w:val="24"/>
-          <w:szCs w:val="24"/>
-          <w:lang w:val="en-US" w:eastAsia="zh-CN" w:bidi="ar"/>
-        </w:rPr>
-        <w:t>1.3采集质控：拍摄时规避严重过曝、全黑模糊画面，减少后期清洗工作量。</w:t>
-      </w:r>
-    </w:p>
-    <w:p>
-      <w:pPr>
-        <w:keepNext w:val="0"/>
-        <w:keepLines w:val="0"/>
-        <w:widowControl/>
-        <w:suppressLineNumbers w:val="0"/>
-        <w:spacing w:line="240" w:lineRule="auto"/>
-        <w:jc w:val="left"/>
-      </w:pPr>
-      <w:r>
-        <w:rPr>
-          <w:rFonts w:ascii="宋体" w:hAnsi="宋体" w:eastAsia="宋体" w:cs="宋体"/>
-          <w:kern w:val="0"/>
-          <w:sz w:val="24"/>
-          <w:szCs w:val="24"/>
-          <w:lang w:val="en-US" w:eastAsia="zh-CN" w:bidi="ar"/>
-        </w:rPr>
-        <w:t>2、数据预处理</w:t>
-      </w:r>
-    </w:p>
-    <w:p>
-      <w:pPr>
-        <w:keepNext w:val="0"/>
-        <w:keepLines w:val="0"/>
-        <w:widowControl/>
-        <w:suppressLineNumbers w:val="0"/>
-        <w:spacing w:line="240" w:lineRule="auto"/>
-        <w:ind w:firstLine="420" w:firstLineChars="0"/>
-        <w:jc w:val="left"/>
-      </w:pPr>
-      <w:r>
-        <w:rPr>
-          <w:rFonts w:ascii="宋体" w:hAnsi="宋体" w:eastAsia="宋体" w:cs="宋体"/>
-          <w:kern w:val="0"/>
-          <w:sz w:val="24"/>
-          <w:szCs w:val="24"/>
-          <w:lang w:val="en-US" w:eastAsia="zh-CN" w:bidi="ar"/>
-        </w:rPr>
-        <w:t>2.1数据清洗：剔除全黑、严重过曝、完全无蓝莓目标、画面破损图像；筛</w:t>
-      </w:r>
-      <w:r>
-        <w:rPr>
-          <w:rFonts w:hint="eastAsia" w:ascii="宋体" w:hAnsi="宋体" w:eastAsia="宋体" w:cs="宋体"/>
-          <w:kern w:val="0"/>
-          <w:sz w:val="24"/>
-          <w:szCs w:val="24"/>
-          <w:lang w:val="en-US" w:eastAsia="zh-CN" w:bidi="ar"/>
-        </w:rPr>
-        <w:tab/>
-      </w:r>
-      <w:r>
-        <w:rPr>
-          <w:rFonts w:ascii="宋体" w:hAnsi="宋体" w:eastAsia="宋体" w:cs="宋体"/>
-          <w:kern w:val="0"/>
-          <w:sz w:val="24"/>
-          <w:szCs w:val="24"/>
-          <w:lang w:val="en-US" w:eastAsia="zh-CN" w:bidi="ar"/>
-        </w:rPr>
-        <w:t>除269张无法标注的低质量图片。</w:t>
-      </w:r>
-    </w:p>
-    <w:p>
-      <w:pPr>
-        <w:keepNext w:val="0"/>
-        <w:keepLines w:val="0"/>
-        <w:widowControl/>
-        <w:suppressLineNumbers w:val="0"/>
-        <w:spacing w:line="240" w:lineRule="auto"/>
-        <w:ind w:firstLine="420" w:firstLineChars="0"/>
-        <w:jc w:val="left"/>
-      </w:pPr>
-      <w:r>
-        <w:rPr>
-          <w:rFonts w:ascii="宋体" w:hAnsi="宋体" w:eastAsia="宋体" w:cs="宋体"/>
-          <w:kern w:val="0"/>
-          <w:sz w:val="24"/>
-          <w:szCs w:val="24"/>
-          <w:lang w:val="en-US" w:eastAsia="zh-CN" w:bidi="ar"/>
-        </w:rPr>
-        <w:t>2.2数据验证：核对图像完整性、无重复、无水印乱码干扰。</w:t>
-      </w:r>
-    </w:p>
-    <w:p>
-      <w:pPr>
-        <w:keepNext w:val="0"/>
-        <w:keepLines w:val="0"/>
-        <w:widowControl/>
-        <w:suppressLineNumbers w:val="0"/>
-        <w:spacing w:line="240" w:lineRule="auto"/>
-        <w:ind w:firstLine="420" w:firstLineChars="0"/>
-        <w:jc w:val="left"/>
-      </w:pPr>
-      <w:r>
-        <w:rPr>
-          <w:rFonts w:ascii="宋体" w:hAnsi="宋体" w:eastAsia="宋体" w:cs="宋体"/>
-          <w:kern w:val="0"/>
-          <w:sz w:val="24"/>
-          <w:szCs w:val="24"/>
-          <w:lang w:val="en-US" w:eastAsia="zh-CN" w:bidi="ar"/>
-        </w:rPr>
-        <w:t>2.3数据抽样：分层筛选2731张有效样本，保证三类成熟度样本均衡。</w:t>
-      </w:r>
-    </w:p>
-    <w:p>
-      <w:pPr>
-        <w:keepNext w:val="0"/>
-        <w:keepLines w:val="0"/>
-        <w:widowControl/>
-        <w:suppressLineNumbers w:val="0"/>
-        <w:spacing w:line="240" w:lineRule="auto"/>
-        <w:jc w:val="left"/>
-      </w:pPr>
-      <w:r>
-        <w:rPr>
-          <w:rFonts w:ascii="宋体" w:hAnsi="宋体" w:eastAsia="宋体" w:cs="宋体"/>
-          <w:kern w:val="0"/>
-          <w:sz w:val="24"/>
-          <w:szCs w:val="24"/>
-          <w:lang w:val="en-US" w:eastAsia="zh-CN" w:bidi="ar"/>
-        </w:rPr>
-        <w:t>3、数据标注流程</w:t>
-      </w:r>
-    </w:p>
-    <w:p>
-      <w:pPr>
-        <w:keepNext w:val="0"/>
-        <w:keepLines w:val="0"/>
-        <w:widowControl/>
-        <w:suppressLineNumbers w:val="0"/>
-        <w:spacing w:line="240" w:lineRule="auto"/>
-        <w:ind w:firstLine="420" w:firstLineChars="0"/>
-        <w:jc w:val="left"/>
-      </w:pPr>
-      <w:r>
-        <w:rPr>
-          <w:rFonts w:ascii="宋体" w:hAnsi="宋体" w:eastAsia="宋体" w:cs="宋体"/>
-          <w:kern w:val="0"/>
-          <w:sz w:val="24"/>
-          <w:szCs w:val="24"/>
-          <w:lang w:val="en-US" w:eastAsia="zh-CN" w:bidi="ar"/>
-        </w:rPr>
-        <w:t>3.1标注培训：全体标注人员统一学习《蓝莓果实成熟度标注分类规范》，</w:t>
-      </w:r>
-      <w:r>
-        <w:rPr>
-          <w:rFonts w:hint="eastAsia" w:ascii="宋体" w:hAnsi="宋体" w:eastAsia="宋体" w:cs="宋体"/>
-          <w:kern w:val="0"/>
-          <w:sz w:val="24"/>
-          <w:szCs w:val="24"/>
-          <w:lang w:val="en-US" w:eastAsia="zh-CN" w:bidi="ar"/>
-        </w:rPr>
-        <w:tab/>
-      </w:r>
-      <w:r>
-        <w:rPr>
           <w:rFonts w:ascii="宋体" w:hAnsi="宋体" w:eastAsia="宋体" w:cs="宋体"/>
           <w:kern w:val="0"/>
           <w:sz w:val="24"/>
@@ -2559,55 +2235,21 @@
         <w:jc w:val="left"/>
       </w:pPr>
       <w:r>
-        <w:rPr>
-          <w:rFonts w:ascii="宋体" w:hAnsi="宋体" w:eastAsia="宋体" w:cs="宋体"/>
-          <w:kern w:val="0"/>
-          <w:sz w:val="24"/>
-          <w:szCs w:val="24"/>
-          <w:lang w:val="en-US" w:eastAsia="zh-CN" w:bidi="ar"/>
-        </w:rPr>
-        <w:t>3.2初标：全员完成全量2731张图像人工标注。</w:t>
-      </w:r>
-    </w:p>
-    <w:p>
-      <w:pPr>
-        <w:keepNext w:val="0"/>
-        <w:keepLines w:val="0"/>
-        <w:widowControl/>
-        <w:suppressLineNumbers w:val="0"/>
-        <w:spacing w:line="240" w:lineRule="auto"/>
-        <w:ind w:firstLine="420" w:firstLineChars="0"/>
-        <w:jc w:val="left"/>
-      </w:pPr>
-      <w:r>
-        <w:rPr>
-          <w:rFonts w:ascii="宋体" w:hAnsi="宋体" w:eastAsia="宋体" w:cs="宋体"/>
-          <w:kern w:val="0"/>
-          <w:sz w:val="24"/>
-          <w:szCs w:val="24"/>
-          <w:lang w:val="en-US" w:eastAsia="zh-CN" w:bidi="ar"/>
-        </w:rPr>
-        <w:t>3.3抽检复核：按TC609-5-2025-04要求开展抽样复核，生成</w:t>
-      </w:r>
-      <w:r>
-        <w:rPr>
-          <w:rFonts w:hint="eastAsia" w:ascii="宋体" w:hAnsi="宋体" w:eastAsia="宋体" w:cs="宋体"/>
-          <w:kern w:val="0"/>
-          <w:sz w:val="24"/>
-          <w:szCs w:val="24"/>
-          <w:lang w:val="en-US" w:eastAsia="zh-CN" w:bidi="ar"/>
-        </w:rPr>
-        <w:tab/>
-      </w:r>
-      <w:r>
-        <w:rPr>
-          <w:rFonts w:ascii="宋体" w:hAnsi="宋体" w:eastAsia="宋体" w:cs="宋体"/>
-          <w:kern w:val="0"/>
-          <w:sz w:val="24"/>
-          <w:szCs w:val="24"/>
-          <w:lang w:val="en-US" w:eastAsia="zh-CN" w:bidi="ar"/>
-        </w:rPr>
-        <w:t>docs/annotation_review_certificate_template.md复核证明。</w:t>
+        <w:t>3.2标注整理：完成2731张有效图像的标注格式化、标签体系统一和必要的标签修正，输出YOLO normalized xywh格式标注文件。</w:t>
+      </w:r>
+    </w:p>
+    <w:p>
+      <w:pPr>
+        <w:keepNext w:val="0"/>
+        <w:keepLines w:val="0"/>
+        <w:widowControl/>
+        <w:suppressLineNumbers w:val="0"/>
+        <w:spacing w:line="240" w:lineRule="auto"/>
+        <w:ind w:firstLine="420" w:firstLineChars="0"/>
+        <w:jc w:val="left"/>
+      </w:pPr>
+      <w:r>
+        <w:t>3.3抽检复核：已开展40张、856个标注框的阶段性人工复核，生成docs/annotation_review_certificate_template.md复核证明；该比例用于候选包预评估，正式申报如需更高置信度应补抽至约273-300张。</w:t>
       </w:r>
     </w:p>
     <w:p>
@@ -4218,75 +3860,21 @@
         <w:jc w:val="left"/>
       </w:pPr>
       <w:r>
-        <w:rPr>
-          <w:rFonts w:ascii="宋体" w:hAnsi="宋体" w:eastAsia="宋体" w:cs="宋体"/>
-          <w:kern w:val="0"/>
-          <w:sz w:val="24"/>
-          <w:szCs w:val="24"/>
-          <w:lang w:val="en-US" w:eastAsia="zh-CN" w:bidi="ar"/>
-        </w:rPr>
-        <w:t>1.1本数据集已完成TC609标准化格式整理，元数据结构符合</w:t>
-      </w:r>
-      <w:r>
-        <w:rPr>
-          <w:rFonts w:hint="eastAsia" w:ascii="宋体" w:hAnsi="宋体" w:eastAsia="宋体" w:cs="宋体"/>
-          <w:kern w:val="0"/>
-          <w:sz w:val="24"/>
-          <w:szCs w:val="24"/>
-          <w:lang w:val="en-US" w:eastAsia="zh-CN" w:bidi="ar"/>
-        </w:rPr>
-        <w:tab/>
-      </w:r>
-      <w:r>
-        <w:rPr>
-          <w:rFonts w:ascii="宋体" w:hAnsi="宋体" w:eastAsia="宋体" w:cs="宋体"/>
-          <w:kern w:val="0"/>
-          <w:sz w:val="24"/>
-          <w:szCs w:val="24"/>
-          <w:lang w:val="en-US" w:eastAsia="zh-CN" w:bidi="ar"/>
-        </w:rPr>
-        <w:t>TC609-5-2025-02JSON规范，适配YOLO目标检测训练，属于高质量数据集</w:t>
-      </w:r>
-      <w:r>
-        <w:rPr>
-          <w:rFonts w:hint="eastAsia" w:ascii="宋体" w:hAnsi="宋体" w:eastAsia="宋体" w:cs="宋体"/>
-          <w:kern w:val="0"/>
-          <w:sz w:val="24"/>
-          <w:szCs w:val="24"/>
-          <w:lang w:val="en-US" w:eastAsia="zh-CN" w:bidi="ar"/>
-        </w:rPr>
-        <w:tab/>
-      </w:r>
-      <w:r>
-        <w:rPr>
-          <w:rFonts w:ascii="宋体" w:hAnsi="宋体" w:eastAsia="宋体" w:cs="宋体"/>
-          <w:kern w:val="0"/>
-          <w:sz w:val="24"/>
-          <w:szCs w:val="24"/>
-          <w:lang w:val="en-US" w:eastAsia="zh-CN" w:bidi="ar"/>
-        </w:rPr>
-        <w:t>提交包。</w:t>
-      </w:r>
-    </w:p>
-    <w:p>
-      <w:pPr>
-        <w:keepNext w:val="0"/>
-        <w:keepLines w:val="0"/>
-        <w:widowControl/>
-        <w:suppressLineNumbers w:val="0"/>
-        <w:spacing w:line="240" w:lineRule="auto"/>
-        <w:ind w:firstLine="420" w:firstLineChars="0"/>
-        <w:jc w:val="left"/>
-      </w:pPr>
-      <w:r>
-        <w:rPr>
-          <w:rFonts w:ascii="宋体" w:hAnsi="宋体" w:eastAsia="宋体" w:cs="宋体"/>
-          <w:kern w:val="0"/>
-          <w:sz w:val="24"/>
-          <w:szCs w:val="24"/>
-          <w:lang w:val="en-US" w:eastAsia="zh-CN" w:bidi="ar"/>
-        </w:rPr>
-        <w:t>1.2已按TC609-5-2025-04完成三维度质量评测（说明文档95.0/数据质量99.9/模型应用94.2，综合96.4，均达90分阈值），授权、来源、原始时间、标注复核、独立测试均已确认归档。</w:t>
+        <w:t>1.1本数据集已完成TC609标准化格式整理，元数据结构符合TC609-5-2025-02 JSON规范，适配YOLO目标检测训练，当前属于高质量数据集候选提交包。</w:t>
+      </w:r>
+    </w:p>
+    <w:p>
+      <w:pPr>
+        <w:keepNext w:val="0"/>
+        <w:keepLines w:val="0"/>
+        <w:widowControl/>
+        <w:suppressLineNumbers w:val="0"/>
+        <w:spacing w:line="240" w:lineRule="auto"/>
+        <w:ind w:firstLine="420" w:firstLineChars="0"/>
+        <w:jc w:val="left"/>
+      </w:pPr>
+      <w:r>
+        <w:t>1.2已按TC609-5-2025-04完成内部预评估：说明文档85.0、数据质量99.9、模型应用94.2，综合参考93.0。数据质量和模型应用维度达到90分阈值；说明文档维度因真实技术支持方式和访问渠道待确认，暂不能按正式达标处理。</w:t>
       </w:r>
     </w:p>
     <w:p>
@@ -4383,75 +3971,21 @@
         <w:jc w:val="left"/>
       </w:pPr>
       <w:r>
-        <w:rPr>
-          <w:rFonts w:ascii="宋体" w:hAnsi="宋体" w:eastAsia="宋体" w:cs="宋体"/>
-          <w:kern w:val="0"/>
-          <w:sz w:val="24"/>
-          <w:szCs w:val="24"/>
-          <w:lang w:val="en-US" w:eastAsia="zh-CN" w:bidi="ar"/>
-        </w:rPr>
-        <w:t>2.4完成标注抽检，输出复核证明文档。</w:t>
-      </w:r>
-    </w:p>
-    <w:p>
-      <w:pPr>
-        <w:keepNext w:val="0"/>
-        <w:keepLines w:val="0"/>
-        <w:widowControl/>
-        <w:suppressLineNumbers w:val="0"/>
-        <w:spacing w:line="240" w:lineRule="auto"/>
-        <w:ind w:firstLine="420" w:firstLineChars="0"/>
-        <w:jc w:val="left"/>
-      </w:pPr>
-      <w:r>
-        <w:rPr>
-          <w:rFonts w:ascii="宋体" w:hAnsi="宋体" w:eastAsia="宋体" w:cs="宋体"/>
-          <w:kern w:val="0"/>
-          <w:sz w:val="24"/>
-          <w:szCs w:val="24"/>
-          <w:lang w:val="en-US" w:eastAsia="zh-CN" w:bidi="ar"/>
-        </w:rPr>
-        <w:t>2.5依据TC609-5-2025-04三大维度（说明文档、数据质量、模型应用）完</w:t>
-      </w:r>
-      <w:r>
-        <w:rPr>
-          <w:rFonts w:hint="eastAsia" w:ascii="宋体" w:hAnsi="宋体" w:eastAsia="宋体" w:cs="宋体"/>
-          <w:kern w:val="0"/>
-          <w:sz w:val="24"/>
-          <w:szCs w:val="24"/>
-          <w:lang w:val="en-US" w:eastAsia="zh-CN" w:bidi="ar"/>
-        </w:rPr>
-        <w:tab/>
-      </w:r>
-      <w:r>
-        <w:rPr>
-          <w:rFonts w:ascii="宋体" w:hAnsi="宋体" w:eastAsia="宋体" w:cs="宋体"/>
-          <w:kern w:val="0"/>
-          <w:sz w:val="24"/>
-          <w:szCs w:val="24"/>
-          <w:lang w:val="en-US" w:eastAsia="zh-CN" w:bidi="ar"/>
-        </w:rPr>
-        <w:t>成百分制质量评分，更新正式质量评测报告</w:t>
-      </w:r>
-      <w:r>
-        <w:rPr>
-          <w:rFonts w:hint="eastAsia" w:ascii="宋体" w:hAnsi="宋体" w:eastAsia="宋体" w:cs="宋体"/>
-          <w:kern w:val="0"/>
-          <w:sz w:val="24"/>
-          <w:szCs w:val="24"/>
-          <w:lang w:val="en-US" w:eastAsia="zh-CN" w:bidi="ar"/>
-        </w:rPr>
-        <w:tab/>
-      </w:r>
-      <w:r>
-        <w:rPr>
-          <w:rFonts w:ascii="宋体" w:hAnsi="宋体" w:eastAsia="宋体" w:cs="宋体"/>
-          <w:kern w:val="0"/>
-          <w:sz w:val="24"/>
-          <w:szCs w:val="24"/>
-          <w:lang w:val="en-US" w:eastAsia="zh-CN" w:bidi="ar"/>
-        </w:rPr>
-        <w:t>docs/quality_evaluation_report.md。</w:t>
+        <w:t>2.4已完成40张阶段性标注抽检；如正式申报要求10%抽检，应补抽至约273-300张并更新复核证明。</w:t>
+      </w:r>
+    </w:p>
+    <w:p>
+      <w:pPr>
+        <w:keepNext w:val="0"/>
+        <w:keepLines w:val="0"/>
+        <w:widowControl/>
+        <w:suppressLineNumbers w:val="0"/>
+        <w:spacing w:line="240" w:lineRule="auto"/>
+        <w:ind w:firstLine="420" w:firstLineChars="0"/>
+        <w:jc w:val="left"/>
+      </w:pPr>
+      <w:r>
+        <w:t>2.5依据TC609-5-2025-04三大维度（说明文档、数据质量、模型应用）完成内部预评估，更新docs/quality_evaluation_report.md；C1/C2回填后需重新计算说明文档维度。</w:t>
       </w:r>
     </w:p>
     <w:p>
@@ -4666,6 +4200,18 @@
         </w:rPr>
       </w:pPr>
       <w:r>
+        <w:t>1.4质量评测报告：docs/quality_evaluation_report.md（内部预评估：说明文档85.0/数据质量99.9/模型应用94.2；说明文档维度待C1/C2回填后复评）</w:t>
+      </w:r>
+    </w:p>
+    <w:p>
+      <w:pPr>
+        <w:keepNext w:val="0"/>
+        <w:keepLines w:val="0"/>
+        <w:widowControl/>
+        <w:suppressLineNumbers w:val="0"/>
+        <w:spacing w:line="240" w:lineRule="auto"/>
+        <w:ind w:firstLine="420" w:firstLineChars="0"/>
+        <w:jc w:val="left"/>
         <w:rPr>
           <w:rFonts w:hint="default" w:ascii="宋体" w:hAnsi="宋体" w:eastAsia="宋体" w:cs="宋体"/>
           <w:kern w:val="0"/>
@@ -4673,55 +4219,9 @@
           <w:szCs w:val="24"/>
           <w:lang w:val="en-US" w:eastAsia="zh-CN" w:bidi="ar"/>
         </w:rPr>
-        <w:t>1.4质量评测报告：docs/quality_evaluation_report.md（已完成正式打分：说明文档95.0/数据质量99.9/模型应用94.2，综合</w:t>
-      </w:r>
-      <w:r>
-        <w:rPr>
-          <w:rFonts w:hint="eastAsia" w:ascii="宋体" w:hAnsi="宋体" w:eastAsia="宋体" w:cs="宋体"/>
-          <w:kern w:val="0"/>
-          <w:sz w:val="24"/>
-          <w:szCs w:val="24"/>
-          <w:lang w:val="en-US" w:eastAsia="zh-CN" w:bidi="ar"/>
-        </w:rPr>
-        <w:tab/>
-      </w:r>
-      <w:r>
-        <w:rPr>
-          <w:rFonts w:hint="default" w:ascii="宋体" w:hAnsi="宋体" w:eastAsia="宋体" w:cs="宋体"/>
-          <w:kern w:val="0"/>
-          <w:sz w:val="24"/>
-          <w:szCs w:val="24"/>
-          <w:lang w:val="en-US" w:eastAsia="zh-CN" w:bidi="ar"/>
-        </w:rPr>
-        <w:t>96.4，均达标）</w:t>
-      </w:r>
-    </w:p>
-    <w:p>
-      <w:pPr>
-        <w:keepNext w:val="0"/>
-        <w:keepLines w:val="0"/>
-        <w:widowControl/>
-        <w:suppressLineNumbers w:val="0"/>
-        <w:spacing w:line="240" w:lineRule="auto"/>
-        <w:ind w:firstLine="420" w:firstLineChars="0"/>
-        <w:jc w:val="left"/>
-        <w:rPr>
-          <w:rFonts w:hint="default" w:ascii="宋体" w:hAnsi="宋体" w:eastAsia="宋体" w:cs="宋体"/>
-          <w:kern w:val="0"/>
-          <w:sz w:val="24"/>
-          <w:szCs w:val="24"/>
-          <w:lang w:val="en-US" w:eastAsia="zh-CN" w:bidi="ar"/>
-        </w:rPr>
-      </w:pPr>
-      <w:r>
-        <w:rPr>
-          <w:rFonts w:hint="default" w:ascii="宋体" w:hAnsi="宋体" w:eastAsia="宋体" w:cs="宋体"/>
-          <w:kern w:val="0"/>
-          <w:sz w:val="24"/>
-          <w:szCs w:val="24"/>
-          <w:lang w:val="en-US" w:eastAsia="zh-CN" w:bidi="ar"/>
-        </w:rPr>
-        <w:t>1.5模型验证报告：docs/蓝莓成熟度数据集模型验证报告.md</w:t>
+      </w:pPr>
+      <w:r>
+        <w:t>1.5模型验证报告：docs/model_validation_report.md</w:t>
       </w:r>
     </w:p>
     <w:p>

</xml_diff>